<commit_message>
letters: lift the number and date off the rule, drop the attachments block, and start the list table on its own page
</commit_message>
<xml_diff>
--- a/backend/documents/letter_templates/eligibility_single.docx
+++ b/backend/documents/letter_templates/eligibility_single.docx
@@ -1,6 +1,6 @@
 
 <file path=word/document.xml><?xml version="1.0" encoding="utf-8"?>
-<w:document xmlns:a="http://schemas.openxmlformats.org/drawingml/2006/main" xmlns:mc="http://schemas.openxmlformats.org/markup-compatibility/2006" xmlns:ns3="urn:schemas-microsoft-com:office:office" xmlns:pic="http://schemas.openxmlformats.org/drawingml/2006/picture" xmlns:r="http://schemas.openxmlformats.org/officeDocument/2006/relationships" xmlns:v="urn:schemas-microsoft-com:vml" xmlns:w="http://schemas.openxmlformats.org/wordprocessingml/2006/main" xmlns:w14="http://schemas.microsoft.com/office/word/2010/wordml" xmlns:wp="http://schemas.openxmlformats.org/drawingml/2006/wordprocessingDrawing" xmlns:wps="http://schemas.microsoft.com/office/word/2010/wordprocessingShape">
+<w:document xmlns:a="http://schemas.openxmlformats.org/drawingml/2006/main" xmlns:mc="http://schemas.openxmlformats.org/markup-compatibility/2006" xmlns:o="urn:schemas-microsoft-com:office:office" xmlns:pic="http://schemas.openxmlformats.org/drawingml/2006/picture" xmlns:r="http://schemas.openxmlformats.org/officeDocument/2006/relationships" xmlns:v="urn:schemas-microsoft-com:vml" xmlns:w="http://schemas.openxmlformats.org/wordprocessingml/2006/main" xmlns:w14="http://schemas.microsoft.com/office/word/2010/wordml" xmlns:wp="http://schemas.openxmlformats.org/drawingml/2006/wordprocessingDrawing" xmlns:wps="http://schemas.microsoft.com/office/word/2010/wordprocessingShape">
   <w:body>
     <w:p>
       <w:pPr>
@@ -13,7 +13,7 @@
       </w:pPr>
       <w:r>
         <w:pict>
-          <v:rect style="width:0.0pt;height:1.5pt" ns3:hr="t" ns3:hrstd="t" ns3:hralign="center" fillcolor="#A0A0A0" stroked="f"/>
+          <v:rect style="width:0.0pt;height:1.5pt" o:hr="t" o:hrstd="t" o:hralign="center" fillcolor="#A0A0A0" stroked="f"/>
         </w:pict>
       </w:r>
       <w:r>
@@ -1785,6 +1785,11 @@
         </w:rPr>
       </w:r>
     </w:p>
+    <w:p/>
+    <w:p/>
+    <w:p/>
+    <w:p/>
+    <w:p/>
     <w:p>
       <w:pPr>
         <w:keepNext w:val="0"/>
@@ -4826,7 +4831,7 @@
 </file>
 
 <file path=word/header1.xml><?xml version="1.0" encoding="utf-8"?>
-<w:hdr xmlns:mc="http://schemas.openxmlformats.org/markup-compatibility/2006" xmlns:o="urn:schemas-microsoft-com:office:office" xmlns:r="http://schemas.openxmlformats.org/officeDocument/2006/relationships" xmlns:m="http://schemas.openxmlformats.org/officeDocument/2006/math" xmlns:v="urn:schemas-microsoft-com:vml" xmlns:wp="http://schemas.openxmlformats.org/drawingml/2006/wordprocessingDrawing" xmlns:w10="urn:schemas-microsoft-com:office:word" xmlns:w="http://schemas.openxmlformats.org/wordprocessingml/2006/main" xmlns:wne="http://schemas.microsoft.com/office/word/2006/wordml" xmlns:sl="http://schemas.openxmlformats.org/schemaLibrary/2006/main" xmlns:a="http://schemas.openxmlformats.org/drawingml/2006/main" xmlns:pic="http://schemas.openxmlformats.org/drawingml/2006/picture" xmlns:c="http://schemas.openxmlformats.org/drawingml/2006/chart" xmlns:lc="http://schemas.openxmlformats.org/drawingml/2006/lockedCanvas" xmlns:dgm="http://schemas.openxmlformats.org/drawingml/2006/diagram" xmlns:wps="http://schemas.microsoft.com/office/word/2010/wordprocessingShape" xmlns:wpg="http://schemas.microsoft.com/office/word/2010/wordprocessingGroup" xmlns:w14="http://schemas.microsoft.com/office/word/2010/wordml" xmlns:w15="http://schemas.microsoft.com/office/word/2012/wordml" xmlns:w16="http://schemas.microsoft.com/office/word/2018/wordml" xmlns:w16cex="http://schemas.microsoft.com/office/word/2018/wordml/cex" xmlns:w16cid="http://schemas.microsoft.com/office/word/2016/wordml/cid" xmlns="http://schemas.microsoft.com/office/tasks/2019/documenttasks" xmlns:cr="http://schemas.microsoft.com/office/comments/2020/reactions">
+<w:hdr xmlns:a="http://schemas.openxmlformats.org/drawingml/2006/main" xmlns:mc="http://schemas.openxmlformats.org/markup-compatibility/2006" xmlns:pic="http://schemas.openxmlformats.org/drawingml/2006/picture" xmlns:r="http://schemas.openxmlformats.org/officeDocument/2006/relationships" xmlns:w="http://schemas.openxmlformats.org/wordprocessingml/2006/main" xmlns:w14="http://schemas.microsoft.com/office/word/2010/wordml" xmlns:wp="http://schemas.openxmlformats.org/drawingml/2006/wordprocessingDrawing" xmlns:wps="http://schemas.microsoft.com/office/word/2010/wordprocessingShape">
   <w:p>
     <w:pPr>
       <w:rPr/>
@@ -5873,31 +5878,6 @@
   </w:p>
   <w:p>
     <w:pPr>
-      <w:rPr/>
-    </w:pPr>
-    <w:r>
-      <w:rPr>
-        <w:rtl w:val="0"/>
-      </w:rPr>
-    </w:r>
-  </w:p>
-  <w:p>
-    <w:pPr>
-      <w:widowControl w:val="0"/>
-      <w:spacing w:line="192.00000000000003" w:lineRule="auto"/>
-      <w:jc w:val="right"/>
-      <w:rPr>
-        <w:rFonts w:ascii="Noto Serif" w:cs="Arial" w:eastAsia="Arial" w:hAnsi="Noto Serif"/>
-      </w:rPr>
-    </w:pPr>
-    <w:r>
-      <w:rPr>
-        <w:rtl w:val="0"/>
-      </w:rPr>
-    </w:r>
-  </w:p>
-  <w:p>
-    <w:pPr>
       <w:widowControl w:val="0"/>
       <w:spacing w:line="192.00000000000003" w:lineRule="auto"/>
       <w:jc w:val="right"/>

</xml_diff>